<commit_message>
Réduction du nombre d'exemples et d'exercices
Co-Authored-By: Claude Opus 5.5 <noreply@anthropic.com>
Claude-Session: https://claude.ai/code/session_01HnpDwuMrN4azqfdCpX8D9h
</commit_message>
<xml_diff>
--- a/fiches-2i2d/Fiche_revision_2I2D.docx
+++ b/fiches-2i2d/Fiche_revision_2I2D.docx
@@ -1421,7 +1421,7 @@
           <w:sz w:val="24"/>
           <w:szCs w:val="24"/>
         </w:rPr>
-        <w:t xml:space="preserve">Exemples corrigés – 1 étape</w:t>
+        <w:t xml:space="preserve">Exemples corrigés</w:t>
       </w:r>
     </w:p>
     <w:p>
@@ -1491,7 +1491,7 @@
           <w:sz w:val="21"/>
           <w:szCs w:val="21"/>
         </w:rPr>
-        <w:t xml:space="preserve">Ex 2 : 53×10³ tep → T bois</w:t>
+        <w:t xml:space="preserve">Ex 2 : 4 ktep → T charbon</w:t>
       </w:r>
     </w:p>
     <w:p>
@@ -1505,7 +1505,7 @@
           <w:sz w:val="21"/>
           <w:szCs w:val="21"/>
         </w:rPr>
-        <w:t xml:space="preserve">d : 53 000 tep   F : 1 T bois = 0,3 tep</w:t>
+        <w:t xml:space="preserve">d : 4 ktep = 4 000 tep   F : 1 T charbon = 0,6 tep</w:t>
       </w:r>
     </w:p>
     <w:p>
@@ -1519,25 +1519,25 @@
           <w:sz w:val="21"/>
           <w:szCs w:val="21"/>
         </w:rPr>
-        <w:t xml:space="preserve">R : 53 000 ÷ 0,3 = </w:t>
-      </w:r>
-      <w:r>
-        <w:rPr>
-          <w:rFonts w:ascii="Arial" w:cs="Arial" w:eastAsia="Arial" w:hAnsi="Arial"/>
-          <w:b/>
-          <w:bCs/>
-          <w:sz w:val="21"/>
-          <w:szCs w:val="21"/>
-        </w:rPr>
-        <w:t xml:space="preserve">176 667 T de bois</w:t>
-      </w:r>
-      <w:r>
-        <w:rPr>
-          <w:rFonts w:ascii="Arial" w:cs="Arial" w:eastAsia="Arial" w:hAnsi="Arial"/>
-          <w:sz w:val="21"/>
-          <w:szCs w:val="21"/>
-        </w:rPr>
-        <w:t xml:space="preserve"> (≈ 176,7 kT)</w:t>
+        <w:t xml:space="preserve">R : 4 000 ÷ 0,6 = </w:t>
+      </w:r>
+      <w:r>
+        <w:rPr>
+          <w:rFonts w:ascii="Arial" w:cs="Arial" w:eastAsia="Arial" w:hAnsi="Arial"/>
+          <w:b/>
+          <w:bCs/>
+          <w:sz w:val="21"/>
+          <w:szCs w:val="21"/>
+        </w:rPr>
+        <w:t xml:space="preserve">6 667 T de charbon</w:t>
+      </w:r>
+      <w:r>
+        <w:rPr>
+          <w:rFonts w:ascii="Arial" w:cs="Arial" w:eastAsia="Arial" w:hAnsi="Arial"/>
+          <w:sz w:val="21"/>
+          <w:szCs w:val="21"/>
+        </w:rPr>
+        <w:t xml:space="preserve"> (on divise : tep → combustible)</w:t>
       </w:r>
     </w:p>
     <w:p>
@@ -1553,7 +1553,7 @@
           <w:sz w:val="21"/>
           <w:szCs w:val="21"/>
         </w:rPr>
-        <w:t xml:space="preserve">Ex 3 : 4 ktep → T charbon</w:t>
+        <w:t xml:space="preserve">Ex 3 : 6,27 kg uranium → ktep</w:t>
       </w:r>
     </w:p>
     <w:p>
@@ -1567,7 +1567,7 @@
           <w:sz w:val="21"/>
           <w:szCs w:val="21"/>
         </w:rPr>
-        <w:t xml:space="preserve">d : 4 ktep = 4 000 tep   F : 1 T charbon = 0,6 tep</w:t>
+        <w:t xml:space="preserve">d : 6,27 kg = 6 270 g   F : 1 g uranium = 10 tep</w:t>
       </w:r>
     </w:p>
     <w:p>
@@ -1581,25 +1581,17 @@
           <w:sz w:val="21"/>
           <w:szCs w:val="21"/>
         </w:rPr>
-        <w:t xml:space="preserve">R : 4 000 ÷ 0,6 = </w:t>
-      </w:r>
-      <w:r>
-        <w:rPr>
-          <w:rFonts w:ascii="Arial" w:cs="Arial" w:eastAsia="Arial" w:hAnsi="Arial"/>
-          <w:b/>
-          <w:bCs/>
-          <w:sz w:val="21"/>
-          <w:szCs w:val="21"/>
-        </w:rPr>
-        <w:t xml:space="preserve">6 667 T de charbon</w:t>
-      </w:r>
-      <w:r>
-        <w:rPr>
-          <w:rFonts w:ascii="Arial" w:cs="Arial" w:eastAsia="Arial" w:hAnsi="Arial"/>
-          <w:sz w:val="21"/>
-          <w:szCs w:val="21"/>
-        </w:rPr>
-        <w:t xml:space="preserve"> (on divise : tep → combustible)</w:t>
+        <w:t xml:space="preserve">R : 6 270 × 10 = 62 700 tep = </w:t>
+      </w:r>
+      <w:r>
+        <w:rPr>
+          <w:rFonts w:ascii="Arial" w:cs="Arial" w:eastAsia="Arial" w:hAnsi="Arial"/>
+          <w:b/>
+          <w:bCs/>
+          <w:sz w:val="21"/>
+          <w:szCs w:val="21"/>
+        </w:rPr>
+        <w:t xml:space="preserve">62,7 ktep</w:t>
       </w:r>
     </w:p>
     <w:p>
@@ -1615,7 +1607,7 @@
           <w:sz w:val="21"/>
           <w:szCs w:val="21"/>
         </w:rPr>
-        <w:t xml:space="preserve">Ex 4 : 2,7 MWh → GJ</w:t>
+        <w:t xml:space="preserve">Ex 4 : 23,4 T essence → J</w:t>
       </w:r>
     </w:p>
     <w:p>
@@ -1629,7 +1621,7 @@
           <w:sz w:val="21"/>
           <w:szCs w:val="21"/>
         </w:rPr>
-        <w:t xml:space="preserve">d : 2,7 MWh = 2,7×10⁶ Wh   F : 1 Wh = 3 600 J</w:t>
+        <w:t xml:space="preserve">Étape 1 : 23,4 × 1,05 = 24,57 tep</w:t>
       </w:r>
     </w:p>
     <w:p>
@@ -1643,33 +1635,7 @@
           <w:sz w:val="21"/>
           <w:szCs w:val="21"/>
         </w:rPr>
-        <w:t xml:space="preserve">R : 2,7×10⁶ × 3 600 = 9,72×10⁹ J = </w:t>
-      </w:r>
-      <w:r>
-        <w:rPr>
-          <w:rFonts w:ascii="Arial" w:cs="Arial" w:eastAsia="Arial" w:hAnsi="Arial"/>
-          <w:b/>
-          <w:bCs/>
-          <w:sz w:val="21"/>
-          <w:szCs w:val="21"/>
-        </w:rPr>
-        <w:t xml:space="preserve">9,72 GJ</w:t>
-      </w:r>
-    </w:p>
-    <w:p>
-      <w:pPr>
-        <w:spacing w:after="40" w:before="120"/>
-      </w:pPr>
-      <w:r>
-        <w:rPr>
-          <w:rFonts w:ascii="Arial" w:cs="Arial" w:eastAsia="Arial" w:hAnsi="Arial"/>
-          <w:b/>
-          <w:bCs/>
-          <w:color w:val="1F4E79"/>
-          <w:sz w:val="21"/>
-          <w:szCs w:val="21"/>
-        </w:rPr>
-        <w:t xml:space="preserve">Ex 5 : 5,5 Mtep → TWh</w:t>
+        <w:t xml:space="preserve">Étape 2 : 24,57 × 11,6×10⁶ = 2,85×10⁸ Wh</w:t>
       </w:r>
     </w:p>
     <w:p>
@@ -1683,216 +1649,6 @@
           <w:sz w:val="21"/>
           <w:szCs w:val="21"/>
         </w:rPr>
-        <w:t xml:space="preserve">d : 5,5 Mtep = 5,5×10⁶ tep   F : 1 tep = 11,6 MWh</w:t>
-      </w:r>
-    </w:p>
-    <w:p>
-      <w:pPr>
-        <w:spacing w:after="20"/>
-        <w:ind w:left="360"/>
-      </w:pPr>
-      <w:r>
-        <w:rPr>
-          <w:rFonts w:ascii="Arial" w:cs="Arial" w:eastAsia="Arial" w:hAnsi="Arial"/>
-          <w:sz w:val="21"/>
-          <w:szCs w:val="21"/>
-        </w:rPr>
-        <w:t xml:space="preserve">R : 5,5×10⁶ × 11,6 = 63,8×10⁶ MWh = 63,8×10¹² Wh = </w:t>
-      </w:r>
-      <w:r>
-        <w:rPr>
-          <w:rFonts w:ascii="Arial" w:cs="Arial" w:eastAsia="Arial" w:hAnsi="Arial"/>
-          <w:b/>
-          <w:bCs/>
-          <w:sz w:val="21"/>
-          <w:szCs w:val="21"/>
-        </w:rPr>
-        <w:t xml:space="preserve">63,8 TWh</w:t>
-      </w:r>
-    </w:p>
-    <w:p>
-      <w:pPr>
-        <w:spacing w:after="40" w:before="120"/>
-      </w:pPr>
-      <w:r>
-        <w:rPr>
-          <w:rFonts w:ascii="Arial" w:cs="Arial" w:eastAsia="Arial" w:hAnsi="Arial"/>
-          <w:b/>
-          <w:bCs/>
-          <w:color w:val="1F4E79"/>
-          <w:sz w:val="21"/>
-          <w:szCs w:val="21"/>
-        </w:rPr>
-        <w:t xml:space="preserve">Ex 6 : 6,27 kg uranium → ktep</w:t>
-      </w:r>
-    </w:p>
-    <w:p>
-      <w:pPr>
-        <w:spacing w:after="20"/>
-        <w:ind w:left="360"/>
-      </w:pPr>
-      <w:r>
-        <w:rPr>
-          <w:rFonts w:ascii="Arial" w:cs="Arial" w:eastAsia="Arial" w:hAnsi="Arial"/>
-          <w:sz w:val="21"/>
-          <w:szCs w:val="21"/>
-        </w:rPr>
-        <w:t xml:space="preserve">d : 6,27 kg = 6 270 g   F : 1 g uranium = 10 tep</w:t>
-      </w:r>
-    </w:p>
-    <w:p>
-      <w:pPr>
-        <w:spacing w:after="20"/>
-        <w:ind w:left="360"/>
-      </w:pPr>
-      <w:r>
-        <w:rPr>
-          <w:rFonts w:ascii="Arial" w:cs="Arial" w:eastAsia="Arial" w:hAnsi="Arial"/>
-          <w:sz w:val="21"/>
-          <w:szCs w:val="21"/>
-        </w:rPr>
-        <w:t xml:space="preserve">R : 6 270 × 10 = 62 700 tep = </w:t>
-      </w:r>
-      <w:r>
-        <w:rPr>
-          <w:rFonts w:ascii="Arial" w:cs="Arial" w:eastAsia="Arial" w:hAnsi="Arial"/>
-          <w:b/>
-          <w:bCs/>
-          <w:sz w:val="21"/>
-          <w:szCs w:val="21"/>
-        </w:rPr>
-        <w:t xml:space="preserve">62,7 ktep</w:t>
-      </w:r>
-    </w:p>
-    <w:p>
-      <w:pPr>
-        <w:pStyle w:val="Heading2"/>
-        <w:pBdr>
-          <w:bottom w:val="single" w:color="1F4E79" w:sz="6" w:space="2"/>
-        </w:pBdr>
-        <w:spacing w:after="100" w:before="200"/>
-      </w:pPr>
-      <w:r>
-        <w:rPr>
-          <w:rFonts w:ascii="Arial" w:cs="Arial" w:eastAsia="Arial" w:hAnsi="Arial"/>
-          <w:b/>
-          <w:bCs/>
-          <w:color w:val="1F4E79"/>
-          <w:sz w:val="24"/>
-          <w:szCs w:val="24"/>
-        </w:rPr>
-        <w:t xml:space="preserve">Exemples corrigés – 2 ou 3 étapes</w:t>
-      </w:r>
-    </w:p>
-    <w:p>
-      <w:pPr>
-        <w:spacing w:after="40" w:before="120"/>
-      </w:pPr>
-      <w:r>
-        <w:rPr>
-          <w:rFonts w:ascii="Arial" w:cs="Arial" w:eastAsia="Arial" w:hAnsi="Arial"/>
-          <w:b/>
-          <w:bCs/>
-          <w:color w:val="1F4E79"/>
-          <w:sz w:val="21"/>
-          <w:szCs w:val="21"/>
-        </w:rPr>
-        <w:t xml:space="preserve">Ex 7 : 23,4 T bois → Wh</w:t>
-      </w:r>
-    </w:p>
-    <w:p>
-      <w:pPr>
-        <w:spacing w:after="20"/>
-        <w:ind w:left="360"/>
-      </w:pPr>
-      <w:r>
-        <w:rPr>
-          <w:rFonts w:ascii="Arial" w:cs="Arial" w:eastAsia="Arial" w:hAnsi="Arial"/>
-          <w:sz w:val="21"/>
-          <w:szCs w:val="21"/>
-        </w:rPr>
-        <w:t xml:space="preserve">Étape 1 : 23,4 × 0,3 = 7,02 tep</w:t>
-      </w:r>
-    </w:p>
-    <w:p>
-      <w:pPr>
-        <w:spacing w:after="20"/>
-        <w:ind w:left="360"/>
-      </w:pPr>
-      <w:r>
-        <w:rPr>
-          <w:rFonts w:ascii="Arial" w:cs="Arial" w:eastAsia="Arial" w:hAnsi="Arial"/>
-          <w:sz w:val="21"/>
-          <w:szCs w:val="21"/>
-        </w:rPr>
-        <w:t xml:space="preserve">Étape 2 : 7,02 × 11,6×10⁶ = 8,14×10⁷ Wh = </w:t>
-      </w:r>
-      <w:r>
-        <w:rPr>
-          <w:rFonts w:ascii="Arial" w:cs="Arial" w:eastAsia="Arial" w:hAnsi="Arial"/>
-          <w:b/>
-          <w:bCs/>
-          <w:sz w:val="21"/>
-          <w:szCs w:val="21"/>
-        </w:rPr>
-        <w:t xml:space="preserve">81,4 MWh</w:t>
-      </w:r>
-    </w:p>
-    <w:p>
-      <w:pPr>
-        <w:spacing w:after="40" w:before="120"/>
-      </w:pPr>
-      <w:r>
-        <w:rPr>
-          <w:rFonts w:ascii="Arial" w:cs="Arial" w:eastAsia="Arial" w:hAnsi="Arial"/>
-          <w:b/>
-          <w:bCs/>
-          <w:color w:val="1F4E79"/>
-          <w:sz w:val="21"/>
-          <w:szCs w:val="21"/>
-        </w:rPr>
-        <w:t xml:space="preserve">Ex 8 : 23,4 T essence → J</w:t>
-      </w:r>
-    </w:p>
-    <w:p>
-      <w:pPr>
-        <w:spacing w:after="20"/>
-        <w:ind w:left="360"/>
-      </w:pPr>
-      <w:r>
-        <w:rPr>
-          <w:rFonts w:ascii="Arial" w:cs="Arial" w:eastAsia="Arial" w:hAnsi="Arial"/>
-          <w:sz w:val="21"/>
-          <w:szCs w:val="21"/>
-        </w:rPr>
-        <w:t xml:space="preserve">Étape 1 : 23,4 × 1,05 = 24,57 tep</w:t>
-      </w:r>
-    </w:p>
-    <w:p>
-      <w:pPr>
-        <w:spacing w:after="20"/>
-        <w:ind w:left="360"/>
-      </w:pPr>
-      <w:r>
-        <w:rPr>
-          <w:rFonts w:ascii="Arial" w:cs="Arial" w:eastAsia="Arial" w:hAnsi="Arial"/>
-          <w:sz w:val="21"/>
-          <w:szCs w:val="21"/>
-        </w:rPr>
-        <w:t xml:space="preserve">Étape 2 : 24,57 × 11,6×10⁶ = 2,85×10⁸ Wh</w:t>
-      </w:r>
-    </w:p>
-    <w:p>
-      <w:pPr>
-        <w:spacing w:after="20"/>
-        <w:ind w:left="360"/>
-      </w:pPr>
-      <w:r>
-        <w:rPr>
-          <w:rFonts w:ascii="Arial" w:cs="Arial" w:eastAsia="Arial" w:hAnsi="Arial"/>
-          <w:sz w:val="21"/>
-          <w:szCs w:val="21"/>
-        </w:rPr>
         <w:t xml:space="preserve">Étape 3 : 2,85×10⁸ × 3 600 = </w:t>
       </w:r>
       <w:r>
@@ -1904,130 +1660,6 @@
           <w:szCs w:val="21"/>
         </w:rPr>
         <w:t xml:space="preserve">1,03×10¹² J</w:t>
-      </w:r>
-    </w:p>
-    <w:p>
-      <w:pPr>
-        <w:spacing w:after="40" w:before="120"/>
-      </w:pPr>
-      <w:r>
-        <w:rPr>
-          <w:rFonts w:ascii="Arial" w:cs="Arial" w:eastAsia="Arial" w:hAnsi="Arial"/>
-          <w:b/>
-          <w:bCs/>
-          <w:color w:val="1F4E79"/>
-          <w:sz w:val="21"/>
-          <w:szCs w:val="21"/>
-        </w:rPr>
-        <w:t xml:space="preserve">Ex 9 : 3,7 kT uranium → T charbon</w:t>
-      </w:r>
-    </w:p>
-    <w:p>
-      <w:pPr>
-        <w:spacing w:after="20"/>
-        <w:ind w:left="360"/>
-      </w:pPr>
-      <w:r>
-        <w:rPr>
-          <w:rFonts w:ascii="Arial" w:cs="Arial" w:eastAsia="Arial" w:hAnsi="Arial"/>
-          <w:sz w:val="21"/>
-          <w:szCs w:val="21"/>
-        </w:rPr>
-        <w:t xml:space="preserve">Étape 1 : 3,7 kT = 3,7×10⁹ g → 3,7×10⁹ × 10 = 3,7×10¹⁰ tep</w:t>
-      </w:r>
-    </w:p>
-    <w:p>
-      <w:pPr>
-        <w:spacing w:after="20"/>
-        <w:ind w:left="360"/>
-      </w:pPr>
-      <w:r>
-        <w:rPr>
-          <w:rFonts w:ascii="Arial" w:cs="Arial" w:eastAsia="Arial" w:hAnsi="Arial"/>
-          <w:sz w:val="21"/>
-          <w:szCs w:val="21"/>
-        </w:rPr>
-        <w:t xml:space="preserve">Étape 2 : 3,7×10¹⁰ ÷ 0,6 = </w:t>
-      </w:r>
-      <w:r>
-        <w:rPr>
-          <w:rFonts w:ascii="Arial" w:cs="Arial" w:eastAsia="Arial" w:hAnsi="Arial"/>
-          <w:b/>
-          <w:bCs/>
-          <w:sz w:val="21"/>
-          <w:szCs w:val="21"/>
-        </w:rPr>
-        <w:t xml:space="preserve">6,17×10¹⁰ T de charbon</w:t>
-      </w:r>
-      <w:r>
-        <w:rPr>
-          <w:rFonts w:ascii="Arial" w:cs="Arial" w:eastAsia="Arial" w:hAnsi="Arial"/>
-          <w:sz w:val="21"/>
-          <w:szCs w:val="21"/>
-        </w:rPr>
-        <w:t xml:space="preserve"> (on DIVISE)</w:t>
-      </w:r>
-    </w:p>
-    <w:p>
-      <w:pPr>
-        <w:spacing w:after="40" w:before="120"/>
-      </w:pPr>
-      <w:r>
-        <w:rPr>
-          <w:rFonts w:ascii="Arial" w:cs="Arial" w:eastAsia="Arial" w:hAnsi="Arial"/>
-          <w:b/>
-          <w:bCs/>
-          <w:color w:val="1F4E79"/>
-          <w:sz w:val="21"/>
-          <w:szCs w:val="21"/>
-        </w:rPr>
-        <w:t xml:space="preserve">Ex 10 : 3,7 T uranium → Wh</w:t>
-      </w:r>
-    </w:p>
-    <w:p>
-      <w:pPr>
-        <w:spacing w:after="20"/>
-        <w:ind w:left="360"/>
-      </w:pPr>
-      <w:r>
-        <w:rPr>
-          <w:rFonts w:ascii="Arial" w:cs="Arial" w:eastAsia="Arial" w:hAnsi="Arial"/>
-          <w:sz w:val="21"/>
-          <w:szCs w:val="21"/>
-        </w:rPr>
-        <w:t xml:space="preserve">Étape 1 : 3,7 T = 3,7×10⁶ g → 3,7×10⁶ ÷ 0,0001 = 3,7×10¹⁰ « paquets » de 11,6 kWh</w:t>
-      </w:r>
-    </w:p>
-    <w:p>
-      <w:pPr>
-        <w:spacing w:after="20"/>
-        <w:ind w:left="360"/>
-      </w:pPr>
-      <w:r>
-        <w:rPr>
-          <w:rFonts w:ascii="Arial" w:cs="Arial" w:eastAsia="Arial" w:hAnsi="Arial"/>
-          <w:sz w:val="21"/>
-          <w:szCs w:val="21"/>
-        </w:rPr>
-        <w:t xml:space="preserve">Étape 2 : 3,7×10¹⁰ × 11 600 Wh = </w:t>
-      </w:r>
-      <w:r>
-        <w:rPr>
-          <w:rFonts w:ascii="Arial" w:cs="Arial" w:eastAsia="Arial" w:hAnsi="Arial"/>
-          <w:b/>
-          <w:bCs/>
-          <w:sz w:val="21"/>
-          <w:szCs w:val="21"/>
-        </w:rPr>
-        <w:t xml:space="preserve">4,29×10¹⁴ Wh</w:t>
-      </w:r>
-      <w:r>
-        <w:rPr>
-          <w:rFonts w:ascii="Arial" w:cs="Arial" w:eastAsia="Arial" w:hAnsi="Arial"/>
-          <w:sz w:val="21"/>
-          <w:szCs w:val="21"/>
-        </w:rPr>
-        <w:t xml:space="preserve">  (ne pas oublier le × 11 600 !)</w:t>
       </w:r>
     </w:p>
     <w:p>
@@ -2191,7 +1823,7 @@
           <w:sz w:val="21"/>
           <w:szCs w:val="21"/>
         </w:rPr>
-        <w:t xml:space="preserve">Ex 11 : P = 5 kW, Δt = 200 s → E en J</w:t>
+        <w:t xml:space="preserve">Ex 5 : P = 5 kW, Δt = 200 s → E en J</w:t>
       </w:r>
     </w:p>
     <w:p>
@@ -2231,153 +1863,7 @@
           <w:sz w:val="21"/>
           <w:szCs w:val="21"/>
         </w:rPr>
-        <w:t xml:space="preserve">Ex 12 : P = 4,2 MW, Δt = 50 s → E en Wh</w:t>
-      </w:r>
-    </w:p>
-    <w:p>
-      <w:pPr>
-        <w:spacing w:after="20"/>
-        <w:ind w:left="360"/>
-      </w:pPr>
-      <w:r>
-        <w:rPr>
-          <w:rFonts w:ascii="Arial" w:cs="Arial" w:eastAsia="Arial" w:hAnsi="Arial"/>
-          <w:sz w:val="21"/>
-          <w:szCs w:val="21"/>
-        </w:rPr>
-        <w:t xml:space="preserve">Δt = 50 ÷ 3 600 h → E = 4,2×10⁶ × 50 ÷ 3 600 = </w:t>
-      </w:r>
-      <w:r>
-        <w:rPr>
-          <w:rFonts w:ascii="Arial" w:cs="Arial" w:eastAsia="Arial" w:hAnsi="Arial"/>
-          <w:b/>
-          <w:bCs/>
-          <w:sz w:val="21"/>
-          <w:szCs w:val="21"/>
-        </w:rPr>
-        <w:t xml:space="preserve">58 333 Wh</w:t>
-      </w:r>
-    </w:p>
-    <w:p>
-      <w:pPr>
-        <w:spacing w:after="40" w:before="120"/>
-      </w:pPr>
-      <w:r>
-        <w:rPr>
-          <w:rFonts w:ascii="Arial" w:cs="Arial" w:eastAsia="Arial" w:hAnsi="Arial"/>
-          <w:b/>
-          <w:bCs/>
-          <w:color w:val="1F4E79"/>
-          <w:sz w:val="21"/>
-          <w:szCs w:val="21"/>
-        </w:rPr>
-        <w:t xml:space="preserve">Ex 13 : P = 0,4 GW, Δt = 2 h → E en J</w:t>
-      </w:r>
-    </w:p>
-    <w:p>
-      <w:pPr>
-        <w:spacing w:after="20"/>
-        <w:ind w:left="360"/>
-      </w:pPr>
-      <w:r>
-        <w:rPr>
-          <w:rFonts w:ascii="Arial" w:cs="Arial" w:eastAsia="Arial" w:hAnsi="Arial"/>
-          <w:sz w:val="21"/>
-          <w:szCs w:val="21"/>
-        </w:rPr>
-        <w:t xml:space="preserve">Δt = 7 200 s → E = 0,4×10⁹ × 7 200 = </w:t>
-      </w:r>
-      <w:r>
-        <w:rPr>
-          <w:rFonts w:ascii="Arial" w:cs="Arial" w:eastAsia="Arial" w:hAnsi="Arial"/>
-          <w:b/>
-          <w:bCs/>
-          <w:sz w:val="21"/>
-          <w:szCs w:val="21"/>
-        </w:rPr>
-        <w:t xml:space="preserve">2,88×10¹² J</w:t>
-      </w:r>
-      <w:r>
-        <w:rPr>
-          <w:rFonts w:ascii="Arial" w:cs="Arial" w:eastAsia="Arial" w:hAnsi="Arial"/>
-          <w:sz w:val="21"/>
-          <w:szCs w:val="21"/>
-        </w:rPr>
-        <w:t xml:space="preserve"> = 2,88 TJ</w:t>
-      </w:r>
-    </w:p>
-    <w:p>
-      <w:pPr>
-        <w:spacing w:after="40" w:before="120"/>
-      </w:pPr>
-      <w:r>
-        <w:rPr>
-          <w:rFonts w:ascii="Arial" w:cs="Arial" w:eastAsia="Arial" w:hAnsi="Arial"/>
-          <w:b/>
-          <w:bCs/>
-          <w:color w:val="1F4E79"/>
-          <w:sz w:val="21"/>
-          <w:szCs w:val="21"/>
-        </w:rPr>
-        <w:t xml:space="preserve">Ex 14 : E = 30 kWh, P = 1 000 W → Δt</w:t>
-      </w:r>
-    </w:p>
-    <w:p>
-      <w:pPr>
-        <w:spacing w:after="20"/>
-        <w:ind w:left="360"/>
-      </w:pPr>
-      <w:r>
-        <w:rPr>
-          <w:rFonts w:ascii="Arial" w:cs="Arial" w:eastAsia="Arial" w:hAnsi="Arial"/>
-          <w:sz w:val="21"/>
-          <w:szCs w:val="21"/>
-        </w:rPr>
-        <w:t xml:space="preserve">Δt = 30 000 ÷ 1 000 = </w:t>
-      </w:r>
-      <w:r>
-        <w:rPr>
-          <w:rFonts w:ascii="Arial" w:cs="Arial" w:eastAsia="Arial" w:hAnsi="Arial"/>
-          <w:b/>
-          <w:bCs/>
-          <w:sz w:val="21"/>
-          <w:szCs w:val="21"/>
-        </w:rPr>
-        <w:t xml:space="preserve">30 h</w:t>
-      </w:r>
-      <w:r>
-        <w:rPr>
-          <w:rFonts w:ascii="Arial" w:cs="Arial" w:eastAsia="Arial" w:hAnsi="Arial"/>
-          <w:sz w:val="21"/>
-          <w:szCs w:val="21"/>
-        </w:rPr>
-        <w:t xml:space="preserve"> = 30 × 3 600 = </w:t>
-      </w:r>
-      <w:r>
-        <w:rPr>
-          <w:rFonts w:ascii="Arial" w:cs="Arial" w:eastAsia="Arial" w:hAnsi="Arial"/>
-          <w:b/>
-          <w:bCs/>
-          <w:sz w:val="21"/>
-          <w:szCs w:val="21"/>
-        </w:rPr>
-        <w:t xml:space="preserve">108 000 s</w:t>
-      </w:r>
-    </w:p>
-    <w:p>
-      <w:pPr>
-        <w:spacing w:after="40" w:before="120"/>
-      </w:pPr>
-      <w:r>
-        <w:rPr>
-          <w:rFonts w:ascii="Arial" w:cs="Arial" w:eastAsia="Arial" w:hAnsi="Arial"/>
-          <w:b/>
-          <w:bCs/>
-          <w:color w:val="1F4E79"/>
-          <w:sz w:val="21"/>
-          <w:szCs w:val="21"/>
-        </w:rPr>
-        <w:t xml:space="preserve">Ex 15 (piège) : E = 253,54 GJ, Δt = 400 h → P en MW</w:t>
+        <w:t xml:space="preserve">Ex 6 (piège) : E = 253,54 GJ, Δt = 400 h → P en MW</w:t>
       </w:r>
     </w:p>
     <w:p>
@@ -2529,7 +2015,7 @@
           <w:sz w:val="21"/>
           <w:szCs w:val="21"/>
         </w:rPr>
-        <w:t xml:space="preserve">Ex 16 : le salon (Révision n°2)</w:t>
+        <w:t xml:space="preserve">Ex 7 : le salon (Révision n°2)</w:t>
       </w:r>
     </w:p>
     <w:p>
@@ -2856,7 +2342,7 @@
           <w:sz w:val="21"/>
           <w:szCs w:val="21"/>
         </w:rPr>
-        <w:t xml:space="preserve">Ex 17 : Pa = 12 000 W, Pu = 5 kW → η</w:t>
+        <w:t xml:space="preserve">Ex 8 : Pa = 12 000 W, Pu = 5 kW → η</w:t>
       </w:r>
     </w:p>
     <w:p>
@@ -2896,7 +2382,7 @@
           <w:sz w:val="21"/>
           <w:szCs w:val="21"/>
         </w:rPr>
-        <w:t xml:space="preserve">Ex 18 : Pa = 5,7 kW, η = 37 % → Pu</w:t>
+        <w:t xml:space="preserve">Ex 9 : Pa = 1 250 kW, η = 23 %, 4 h → Eu en GJ</w:t>
       </w:r>
     </w:p>
     <w:p>
@@ -2910,33 +2396,7 @@
           <w:sz w:val="21"/>
           <w:szCs w:val="21"/>
         </w:rPr>
-        <w:t xml:space="preserve">Pu = 5 700 × 0,37 = 2 109 W = </w:t>
-      </w:r>
-      <w:r>
-        <w:rPr>
-          <w:rFonts w:ascii="Arial" w:cs="Arial" w:eastAsia="Arial" w:hAnsi="Arial"/>
-          <w:b/>
-          <w:bCs/>
-          <w:sz w:val="21"/>
-          <w:szCs w:val="21"/>
-        </w:rPr>
-        <w:t xml:space="preserve">2,109 kW</w:t>
-      </w:r>
-    </w:p>
-    <w:p>
-      <w:pPr>
-        <w:spacing w:after="40" w:before="120"/>
-      </w:pPr>
-      <w:r>
-        <w:rPr>
-          <w:rFonts w:ascii="Arial" w:cs="Arial" w:eastAsia="Arial" w:hAnsi="Arial"/>
-          <w:b/>
-          <w:bCs/>
-          <w:color w:val="1F4E79"/>
-          <w:sz w:val="21"/>
-          <w:szCs w:val="21"/>
-        </w:rPr>
-        <w:t xml:space="preserve">Ex 19 : Pu = 0,62 MW, η = 0,56 → Pa</w:t>
+        <w:t xml:space="preserve">Pu = 1 250 000 × 0,23 = 287 500 W</w:t>
       </w:r>
     </w:p>
     <w:p>
@@ -2950,17 +2410,17 @@
           <w:sz w:val="21"/>
           <w:szCs w:val="21"/>
         </w:rPr>
-        <w:t xml:space="preserve">Pa = 620 000 ÷ 0,56 = 1 107 143 W ≈ </w:t>
-      </w:r>
-      <w:r>
-        <w:rPr>
-          <w:rFonts w:ascii="Arial" w:cs="Arial" w:eastAsia="Arial" w:hAnsi="Arial"/>
-          <w:b/>
-          <w:bCs/>
-          <w:sz w:val="21"/>
-          <w:szCs w:val="21"/>
-        </w:rPr>
-        <w:t xml:space="preserve">1,1 MW</w:t>
+        <w:t xml:space="preserve">Eu = 287 500 × 4 = 1,15×10⁶ Wh → × 3 600 = 4,14×10⁹ J = </w:t>
+      </w:r>
+      <w:r>
+        <w:rPr>
+          <w:rFonts w:ascii="Arial" w:cs="Arial" w:eastAsia="Arial" w:hAnsi="Arial"/>
+          <w:b/>
+          <w:bCs/>
+          <w:sz w:val="21"/>
+          <w:szCs w:val="21"/>
+        </w:rPr>
+        <w:t xml:space="preserve">4,14 GJ</w:t>
       </w:r>
     </w:p>
     <w:p>
@@ -2976,195 +2436,7 @@
           <w:sz w:val="21"/>
           <w:szCs w:val="21"/>
         </w:rPr>
-        <w:t xml:space="preserve">Ex 20 : Pa = 1 250 kW, η = 23 %, 4 h → Eu en GJ</w:t>
-      </w:r>
-    </w:p>
-    <w:p>
-      <w:pPr>
-        <w:spacing w:after="20"/>
-        <w:ind w:left="360"/>
-      </w:pPr>
-      <w:r>
-        <w:rPr>
-          <w:rFonts w:ascii="Arial" w:cs="Arial" w:eastAsia="Arial" w:hAnsi="Arial"/>
-          <w:sz w:val="21"/>
-          <w:szCs w:val="21"/>
-        </w:rPr>
-        <w:t xml:space="preserve">Pu = 1 250 000 × 0,23 = 287 500 W</w:t>
-      </w:r>
-    </w:p>
-    <w:p>
-      <w:pPr>
-        <w:spacing w:after="20"/>
-        <w:ind w:left="360"/>
-      </w:pPr>
-      <w:r>
-        <w:rPr>
-          <w:rFonts w:ascii="Arial" w:cs="Arial" w:eastAsia="Arial" w:hAnsi="Arial"/>
-          <w:sz w:val="21"/>
-          <w:szCs w:val="21"/>
-        </w:rPr>
-        <w:t xml:space="preserve">Eu = 287 500 × 4 = 1,15×10⁶ Wh → × 3 600 = 4,14×10⁹ J = </w:t>
-      </w:r>
-      <w:r>
-        <w:rPr>
-          <w:rFonts w:ascii="Arial" w:cs="Arial" w:eastAsia="Arial" w:hAnsi="Arial"/>
-          <w:b/>
-          <w:bCs/>
-          <w:sz w:val="21"/>
-          <w:szCs w:val="21"/>
-        </w:rPr>
-        <w:t xml:space="preserve">4,14 GJ</w:t>
-      </w:r>
-    </w:p>
-    <w:p>
-      <w:pPr>
-        <w:spacing w:after="40" w:before="120"/>
-      </w:pPr>
-      <w:r>
-        <w:rPr>
-          <w:rFonts w:ascii="Arial" w:cs="Arial" w:eastAsia="Arial" w:hAnsi="Arial"/>
-          <w:b/>
-          <w:bCs/>
-          <w:color w:val="1F4E79"/>
-          <w:sz w:val="21"/>
-          <w:szCs w:val="21"/>
-        </w:rPr>
-        <w:t xml:space="preserve">Ex 21 : Pu = 57,3 TW, η = 0,45, 2 860 s → Ea en TWh</w:t>
-      </w:r>
-    </w:p>
-    <w:p>
-      <w:pPr>
-        <w:spacing w:after="20"/>
-        <w:ind w:left="360"/>
-      </w:pPr>
-      <w:r>
-        <w:rPr>
-          <w:rFonts w:ascii="Arial" w:cs="Arial" w:eastAsia="Arial" w:hAnsi="Arial"/>
-          <w:sz w:val="21"/>
-          <w:szCs w:val="21"/>
-        </w:rPr>
-        <w:t xml:space="preserve">Pa = 57,3 ÷ 0,45 = 127,3 TW</w:t>
-      </w:r>
-    </w:p>
-    <w:p>
-      <w:pPr>
-        <w:spacing w:after="20"/>
-        <w:ind w:left="360"/>
-      </w:pPr>
-      <w:r>
-        <w:rPr>
-          <w:rFonts w:ascii="Arial" w:cs="Arial" w:eastAsia="Arial" w:hAnsi="Arial"/>
-          <w:sz w:val="21"/>
-          <w:szCs w:val="21"/>
-        </w:rPr>
-        <w:t xml:space="preserve">Ea = 127,3 × 2 860 ÷ 3 600 = </w:t>
-      </w:r>
-      <w:r>
-        <w:rPr>
-          <w:rFonts w:ascii="Arial" w:cs="Arial" w:eastAsia="Arial" w:hAnsi="Arial"/>
-          <w:b/>
-          <w:bCs/>
-          <w:sz w:val="21"/>
-          <w:szCs w:val="21"/>
-        </w:rPr>
-        <w:t xml:space="preserve">101,2 TWh</w:t>
-      </w:r>
-    </w:p>
-    <w:p>
-      <w:pPr>
-        <w:spacing w:after="40" w:before="120"/>
-      </w:pPr>
-      <w:r>
-        <w:rPr>
-          <w:rFonts w:ascii="Arial" w:cs="Arial" w:eastAsia="Arial" w:hAnsi="Arial"/>
-          <w:b/>
-          <w:bCs/>
-          <w:color w:val="1F4E79"/>
-          <w:sz w:val="21"/>
-          <w:szCs w:val="21"/>
-        </w:rPr>
-        <w:t xml:space="preserve">Ex 22 : Pa = 5,7 kW, pertes = 2 800 W → η</w:t>
-      </w:r>
-    </w:p>
-    <w:p>
-      <w:pPr>
-        <w:spacing w:after="20"/>
-        <w:ind w:left="360"/>
-      </w:pPr>
-      <w:r>
-        <w:rPr>
-          <w:rFonts w:ascii="Arial" w:cs="Arial" w:eastAsia="Arial" w:hAnsi="Arial"/>
-          <w:sz w:val="21"/>
-          <w:szCs w:val="21"/>
-        </w:rPr>
-        <w:t xml:space="preserve">η = (5 700 − 2 800) ÷ 5 700 = 0,51 = </w:t>
-      </w:r>
-      <w:r>
-        <w:rPr>
-          <w:rFonts w:ascii="Arial" w:cs="Arial" w:eastAsia="Arial" w:hAnsi="Arial"/>
-          <w:b/>
-          <w:bCs/>
-          <w:sz w:val="21"/>
-          <w:szCs w:val="21"/>
-        </w:rPr>
-        <w:t xml:space="preserve">51 %</w:t>
-      </w:r>
-    </w:p>
-    <w:p>
-      <w:pPr>
-        <w:spacing w:after="40" w:before="120"/>
-      </w:pPr>
-      <w:r>
-        <w:rPr>
-          <w:rFonts w:ascii="Arial" w:cs="Arial" w:eastAsia="Arial" w:hAnsi="Arial"/>
-          <w:b/>
-          <w:bCs/>
-          <w:color w:val="1F4E79"/>
-          <w:sz w:val="21"/>
-          <w:szCs w:val="21"/>
-        </w:rPr>
-        <w:t xml:space="preserve">Ex 23 : η = 65 %, Pa = 5,7 kW → pertes</w:t>
-      </w:r>
-    </w:p>
-    <w:p>
-      <w:pPr>
-        <w:spacing w:after="20"/>
-        <w:ind w:left="360"/>
-      </w:pPr>
-      <w:r>
-        <w:rPr>
-          <w:rFonts w:ascii="Arial" w:cs="Arial" w:eastAsia="Arial" w:hAnsi="Arial"/>
-          <w:sz w:val="21"/>
-          <w:szCs w:val="21"/>
-        </w:rPr>
-        <w:t xml:space="preserve">Pertes = 5 700 × (1 − 0,65) = </w:t>
-      </w:r>
-      <w:r>
-        <w:rPr>
-          <w:rFonts w:ascii="Arial" w:cs="Arial" w:eastAsia="Arial" w:hAnsi="Arial"/>
-          <w:b/>
-          <w:bCs/>
-          <w:sz w:val="21"/>
-          <w:szCs w:val="21"/>
-        </w:rPr>
-        <w:t xml:space="preserve">1 995 W</w:t>
-      </w:r>
-    </w:p>
-    <w:p>
-      <w:pPr>
-        <w:spacing w:after="40" w:before="120"/>
-      </w:pPr>
-      <w:r>
-        <w:rPr>
-          <w:rFonts w:ascii="Arial" w:cs="Arial" w:eastAsia="Arial" w:hAnsi="Arial"/>
-          <w:b/>
-          <w:bCs/>
-          <w:color w:val="1F4E79"/>
-          <w:sz w:val="21"/>
-          <w:szCs w:val="21"/>
-        </w:rPr>
-        <w:t xml:space="preserve">Ex 24 : centrale nucléaire η = 38 %, Ea = 256 MWh</w:t>
+        <w:t xml:space="preserve">Ex 10 : centrale nucléaire η = 38 %, Ea = 256 MWh</w:t>
       </w:r>
     </w:p>
     <w:p>
@@ -3559,7 +2831,7 @@
           <w:sz w:val="21"/>
           <w:szCs w:val="21"/>
         </w:rPr>
-        <w:t xml:space="preserve">Ex 25 : capteur solaire (TD 1.2 – Exercice 2)</w:t>
+        <w:t xml:space="preserve">Ex 11 : capteur solaire (TD 1.2 – Exercice 2)</w:t>
       </w:r>
     </w:p>
     <w:p>
@@ -3869,7 +3141,7 @@
           <w:sz w:val="21"/>
           <w:szCs w:val="21"/>
         </w:rPr>
-        <w:t xml:space="preserve">Ex 26 : Révision n°3 (D = 50 mm, v = 0,01 … 10 m/s, Ze = 500 Ω, CAN 8 bits)</w:t>
+        <w:t xml:space="preserve">Ex 12 : Révision n°3 (D = 50 mm, v = 0,01 … 10 m/s, Ze = 500 Ω, CAN 8 bits)</w:t>
       </w:r>
     </w:p>
     <w:p>

</xml_diff>